<commit_message>
Manuscript: first-use revision after peer feedback (Learn first, setup, patient bar, tour); updated figures, counts, protocol and brief
Co-Authored-By: Claude Sonnet 5.5 <noreply@anthropic.com>
</commit_message>
<xml_diff>
--- a/docs/publication/manuscript.docx
+++ b/docs/publication/manuscript.docx
@@ -137,7 +137,7 @@
         <w:t>Methods.</w:t>
       </w:r>
       <w:r>
-        <w:t xml:space="preserve"> Case study. A physician-directed, AI-assisted workflow produced a physics-based simulator (extended equation of motion, viscoelasticity, flow-dependent resistance, expiratory flow limitation, gas exchange and hemodynamics), 10 scenarios, 7 asynchrony examples and a Learn section, deployed as a static website with automated testing, a persistent identifier, an open license, privacy-preserving analytics and a feedback channel. We logged decisions and problems as they occurred and report them in structured tables. We verified the model by analytic tests and agreement with one published cohort.</w:t>
+        <w:t xml:space="preserve"> Case study. A physician-directed, AI-assisted workflow produced a physics-based simulator (extended equation of motion, viscoelasticity, flow-dependent resistance, expiratory flow limitation, gas exchange and hemodynamics), 10 scenarios, 7 asynchrony examples and a Learn section, deployed as a static website with automated testing, a persistent identifier, an open license, privacy-preserving analytics and a feedback channel. After informal peer feedback the interface was revised for first-time users (Learn moved to the first tab, a first-run patient setup, a patient bar, a no-scroll layout and a guided tour). We logged decisions and problems as they occurred and report them in structured tables. We verified the model by analytic tests and agreement with one published cohort.</w:t>
       </w:r>
     </w:p>
     <w:p>
@@ -151,7 +151,7 @@
         <w:t>Results.</w:t>
       </w:r>
       <w:r>
-        <w:t xml:space="preserve"> The first working commit was made about 20 minutes after the project folder was created and the archived, citable release followed about 2 hours later on the same evening [CONFIRM, see Section 5.1]. The deliverable is about 2,100 lines of code and markup, including 425 lines of physics engine, 43 automated tests, and recurring running costs of zero for hosting, archiving, analytics and feedback (the AI assistant itself was not free). Twelve decision points and fifteen problems are documented. Several defects were caught by testing against physiological expectations, not by the AI's own first output, including a PEEP-handling inconsistency when adapting the source equation, an expiratory flow-limitation model that failed to reproduce clinically expected PEEP behaviour, and run-away auto-PEEP in scenarios. The model reproduces the mean peak pressure, plateau pressure and auto-PEEP of one published COPD cohort after calibration to it; this is not independent validation. [Learner results: to be added.]</w:t>
+        <w:t xml:space="preserve"> The first working commit was made about 20 minutes after the project folder was created and the archived, citable release followed about 2 hours later on the same evening [CONFIRM, see Section 5.1]. The deliverable is about 2,300 lines of code and markup, including 425 lines of physics engine, 43 automated tests, and recurring running costs of zero for hosting, archiving, analytics and feedback (the AI assistant itself was not free). Sixteen decision points and seventeen problems are documented, including the first-use changes made after peer feedback. Several defects were caught by testing against physiological expectations, not by the AI's own first output, including a PEEP-handling inconsistency when adapting the source equation, an expiratory flow-limitation model that failed to reproduce clinically expected PEEP behaviour, and run-away auto-PEEP in scenarios. The model reproduces the mean peak pressure, plateau pressure and auto-PEEP of one published COPD cohort after calibration to it; this is not independent validation. [Learner results: to be added.]</w:t>
       </w:r>
     </w:p>
     <w:p>
@@ -275,7 +275,7 @@
         <w:spacing w:after="120"/>
       </w:pPr>
       <w:r>
-        <w:t>Git history (12 commits); automated test output; build and deployment logs; the conversation record; the source documents supplied at the outset (a build plan and a parameter sheet); and the external documents reviewed during the project. Dates and counts below come from the repository unless stated.</w:t>
+        <w:t>Git history (17 commits at the time of writing); automated test output; build and deployment logs; the conversation record; the source documents supplied at the outset (a build plan and a parameter sheet); and the external documents reviewed during the project. Dates and counts below come from the repository unless stated.</w:t>
       </w:r>
     </w:p>
     <w:p>
@@ -533,7 +533,7 @@
         <w:spacing w:after="120"/>
       </w:pPr>
       <w:r>
-        <w:t>A ventilator-style screen (large measurements on the left, setpoint dials on the right, bottom tab bar); an animated lung pane (size follows volume, colour follows elastic stress, airway width follows resistance, diaphragm shows patient effort); pressure-volume and flow-volume loops always on screen; triangles marking patient-triggered breaths; a Learn section (how to use, settings, targets, strategies, formulas, expected waveforms generated live by the engine, clinical pearls); 10 scenarios; 7 asynchrony examples; freeze-and-crosshair measurement; and shareable setups.</w:t>
+        <w:t>A ventilator-style screen (large measurements on the left, setpoint dials on the right, bottom tab bar); an animated lung pane (size follows volume, colour follows elastic stress, airway width follows resistance, diaphragm shows patient effort); pressure-volume and flow-volume loops always on screen; triangles marking patient-triggered breaths; a Learn section (how to use, settings, targets, strategies, formulas, expected waveforms generated live by the engine, clinical pearls); 10 scenarios; 7 asynchrony examples; freeze-and-crosshair measurement; and shareable setups. After peer feedback (Section 5.3) the first-use experience was added: the Learn tab is now the first tab and opens with a 60-second quick start; a first-visit dialog asks the learner for a lung type, sex, height, weight and mode (with starting settings chosen from the patient); patient settings sit in a bar at the top of the simulator; the simulator fits the window without scrolling; every number and dial has a hover explanation; and a nine-step guided tour outlines each part of the screen in turn.</w:t>
       </w:r>
     </w:p>
     <w:p>
@@ -543,7 +543,7 @@
       <w:r>
         <w:drawing>
           <wp:inline xmlns:a="http://schemas.openxmlformats.org/drawingml/2006/main" xmlns:pic="http://schemas.openxmlformats.org/drawingml/2006/picture">
-            <wp:extent cx="5852160" cy="3043123"/>
+            <wp:extent cx="5852160" cy="3291840"/>
             <wp:docPr id="2" name="Picture 2"/>
             <wp:cNvGraphicFramePr>
               <a:graphicFrameLocks noChangeAspect="1"/>
@@ -564,7 +564,7 @@
                   <pic:spPr>
                     <a:xfrm>
                       <a:off x="0" y="0"/>
-                      <a:ext cx="5852160" cy="3043123"/>
+                      <a:ext cx="5852160" cy="3291840"/>
                     </a:xfrm>
                     <a:prstGeom prst="rect"/>
                   </pic:spPr>
@@ -584,7 +584,7 @@
           <w:i/>
           <w:sz w:val="18"/>
         </w:rPr>
-        <w:t>Figure 2. The simulator screen (pressure support with patient effort). Large measurements (left), pressure and flow and volume waveforms with triangles at patient-triggered breaths and the dashed patient muscle pressure (centre top), animated lungs with pressure-volume and flow-volume loops (centre bottom), setpoint dials and controls (right).</w:t>
+        <w:t>Figure 2. The simulator screen after the first-use revision (pressure support with patient effort), which fits the window with no scrolling. Patient bar (top), large measurements (left), pressure and flow and volume waveforms with triangles at patient-triggered breaths and the dashed patient muscle pressure (centre top), animated lungs with pressure-volume and flow-volume loops (centre bottom), setpoint dials and controls (right).</w:t>
       </w:r>
     </w:p>
     <w:p>
@@ -1005,6 +1005,112 @@
               <w:rPr>
                 <w:sz w:val="17"/>
               </w:rPr>
+              <w:t>First-run setup (learner picks lung type, patient and mode; starting volume set from predicted body weight)</w:t>
+            </w:r>
+          </w:p>
+        </w:tc>
+        <w:tc>
+          <w:tcPr>
+            <w:tcW w:type="dxa" w:w="3120"/>
+          </w:tcPr>
+          <w:p>
+            <w:pPr>
+              <w:spacing w:after="0"/>
+            </w:pPr>
+            <w:r/>
+            <w:r>
+              <w:rPr>
+                <w:sz w:val="17"/>
+              </w:rPr>
+              <w:t>The case starts at the learner's chosen level</w:t>
+            </w:r>
+          </w:p>
+        </w:tc>
+        <w:tc>
+          <w:tcPr>
+            <w:tcW w:type="dxa" w:w="3120"/>
+          </w:tcPr>
+          <w:p>
+            <w:pPr>
+              <w:spacing w:after="0"/>
+            </w:pPr>
+            <w:r/>
+            <w:r>
+              <w:rPr>
+                <w:sz w:val="17"/>
+              </w:rPr>
+              <w:t>No</w:t>
+            </w:r>
+          </w:p>
+        </w:tc>
+      </w:tr>
+      <w:tr>
+        <w:tc>
+          <w:tcPr>
+            <w:tcW w:type="dxa" w:w="3120"/>
+          </w:tcPr>
+          <w:p>
+            <w:pPr>
+              <w:spacing w:after="0"/>
+            </w:pPr>
+            <w:r/>
+            <w:r>
+              <w:rPr>
+                <w:sz w:val="17"/>
+              </w:rPr>
+              <w:t>Guided tour, quick start and hover explanations (replayable)</w:t>
+            </w:r>
+          </w:p>
+        </w:tc>
+        <w:tc>
+          <w:tcPr>
+            <w:tcW w:type="dxa" w:w="3120"/>
+          </w:tcPr>
+          <w:p>
+            <w:pPr>
+              <w:spacing w:after="0"/>
+            </w:pPr>
+            <w:r/>
+            <w:r>
+              <w:rPr>
+                <w:sz w:val="17"/>
+              </w:rPr>
+              <w:t>Orientation at the learner's own pace</w:t>
+            </w:r>
+          </w:p>
+        </w:tc>
+        <w:tc>
+          <w:tcPr>
+            <w:tcW w:type="dxa" w:w="3120"/>
+          </w:tcPr>
+          <w:p>
+            <w:pPr>
+              <w:spacing w:after="0"/>
+            </w:pPr>
+            <w:r/>
+            <w:r>
+              <w:rPr>
+                <w:sz w:val="17"/>
+              </w:rPr>
+              <w:t>No</w:t>
+            </w:r>
+          </w:p>
+        </w:tc>
+      </w:tr>
+      <w:tr>
+        <w:tc>
+          <w:tcPr>
+            <w:tcW w:type="dxa" w:w="3120"/>
+          </w:tcPr>
+          <w:p>
+            <w:pPr>
+              <w:spacing w:after="0"/>
+            </w:pPr>
+            <w:r/>
+            <w:r>
+              <w:rPr>
+                <w:sz w:val="17"/>
+              </w:rPr>
               <w:t>Not yet implemented: adaptive difficulty from a learner's history; accounts; an authoring interface; multi-language</w:t>
             </w:r>
           </w:p>
@@ -1411,6 +1517,114 @@
           </w:p>
         </w:tc>
       </w:tr>
+      <w:tr>
+        <w:tc>
+          <w:tcPr>
+            <w:tcW w:type="dxa" w:w="4680"/>
+          </w:tcPr>
+          <w:p>
+            <w:pPr>
+              <w:spacing w:after="0"/>
+            </w:pPr>
+            <w:r/>
+            <w:r>
+              <w:rPr>
+                <w:sz w:val="17"/>
+              </w:rPr>
+              <w:t>Manuscript draft, figures, validation script, Word export</w:t>
+            </w:r>
+          </w:p>
+        </w:tc>
+        <w:tc>
+          <w:tcPr>
+            <w:tcW w:type="dxa" w:w="4680"/>
+          </w:tcPr>
+          <w:p>
+            <w:pPr>
+              <w:spacing w:after="0"/>
+            </w:pPr>
+            <w:r/>
+            <w:r>
+              <w:rPr>
+                <w:sz w:val="17"/>
+              </w:rPr>
+              <w:t>22:14 to 22:41</w:t>
+            </w:r>
+          </w:p>
+        </w:tc>
+      </w:tr>
+      <w:tr>
+        <w:tc>
+          <w:tcPr>
+            <w:tcW w:type="dxa" w:w="4680"/>
+          </w:tcPr>
+          <w:p>
+            <w:pPr>
+              <w:spacing w:after="0"/>
+            </w:pPr>
+            <w:r/>
+            <w:r>
+              <w:rPr>
+                <w:sz w:val="17"/>
+              </w:rPr>
+              <w:t>First-use revision after peer feedback: first-run setup, patient bar, Learn first, no-scroll layout, hover tips</w:t>
+            </w:r>
+          </w:p>
+        </w:tc>
+        <w:tc>
+          <w:tcPr>
+            <w:tcW w:type="dxa" w:w="4680"/>
+          </w:tcPr>
+          <w:p>
+            <w:pPr>
+              <w:spacing w:after="0"/>
+            </w:pPr>
+            <w:r/>
+            <w:r>
+              <w:rPr>
+                <w:sz w:val="17"/>
+              </w:rPr>
+              <w:t>23:02</w:t>
+            </w:r>
+          </w:p>
+        </w:tc>
+      </w:tr>
+      <w:tr>
+        <w:tc>
+          <w:tcPr>
+            <w:tcW w:type="dxa" w:w="4680"/>
+          </w:tcPr>
+          <w:p>
+            <w:pPr>
+              <w:spacing w:after="0"/>
+            </w:pPr>
+            <w:r/>
+            <w:r>
+              <w:rPr>
+                <w:sz w:val="17"/>
+              </w:rPr>
+              <w:t>Guided tour</w:t>
+            </w:r>
+          </w:p>
+        </w:tc>
+        <w:tc>
+          <w:tcPr>
+            <w:tcW w:type="dxa" w:w="4680"/>
+          </w:tcPr>
+          <w:p>
+            <w:pPr>
+              <w:spacing w:after="0"/>
+            </w:pPr>
+            <w:r/>
+            <w:r>
+              <w:rPr>
+                <w:sz w:val="17"/>
+              </w:rPr>
+              <w:t>23:05</w:t>
+            </w:r>
+          </w:p>
+        </w:tc>
+      </w:tr>
     </w:tbl>
     <w:p>
       <w:pPr>
@@ -1432,7 +1646,7 @@
       <w:r>
         <w:drawing>
           <wp:inline xmlns:a="http://schemas.openxmlformats.org/drawingml/2006/main" xmlns:pic="http://schemas.openxmlformats.org/drawingml/2006/picture">
-            <wp:extent cx="5852160" cy="2334603"/>
+            <wp:extent cx="5852160" cy="2238195"/>
             <wp:docPr id="4" name="Picture 4"/>
             <wp:cNvGraphicFramePr>
               <a:graphicFrameLocks noChangeAspect="1"/>
@@ -1453,7 +1667,7 @@
                   <pic:spPr>
                     <a:xfrm>
                       <a:off x="0" y="0"/>
-                      <a:ext cx="5852160" cy="2334603"/>
+                      <a:ext cx="5852160" cy="2238195"/>
                     </a:xfrm>
                     <a:prstGeom prst="rect"/>
                   </pic:spPr>
@@ -1473,7 +1687,7 @@
           <w:i/>
           <w:sz w:val="18"/>
         </w:rPr>
-        <w:t>Figure 4. Development timeline from the repository log (24 October 2026, US Eastern). Ticks are commits; decisions (D) and challenges (C) from Sections 6.1 and 6.2 are grouped by build phase, because their exact times were not recorded.</w:t>
+        <w:t>Figure 4. Development timeline from the repository log (24 October 2026, US Eastern), including the peer-feedback iteration at the end. Ticks are commits; decisions (D) and challenges (C) from Sections 6.1 and 6.2 are grouped by build phase, because their exact times were not recorded.</w:t>
       </w:r>
     </w:p>
     <w:p>
@@ -1608,6 +1822,138 @@
       </w:r>
       <w:r>
         <w:t>, then add identity, licence, analytics and feedback.</w:t>
+      </w:r>
+    </w:p>
+    <w:p>
+      <w:pPr>
+        <w:pStyle w:val="Heading2"/>
+      </w:pPr>
+      <w:r>
+        <w:t>5.3 Iteration after informal peer feedback</w:t>
+      </w:r>
+    </w:p>
+    <w:p>
+      <w:pPr>
+        <w:spacing w:after="120"/>
+      </w:pPr>
+      <w:r>
+        <w:t>The tool was shown to [N] peers [CONFIRM: number, roles, how and when feedback was gathered] before any learner study. The feedback, in the author's summary, was that a first-time user could not tell where to start. Two concrete requests were to move the Learn tab forward and to add a guided tour; the author also asked in the same iteration for the patient settings to be placed at the top, for a first-run setup that asks for the lung type and settings, and for the main screen to fit the window without scrolling [CONFIRM which of these also came from reviewers]. These were implemented in two commits about three minutes apart:</w:t>
+      </w:r>
+    </w:p>
+    <w:p>
+      <w:pPr>
+        <w:spacing w:after="40"/>
+        <w:ind w:left="432" w:hanging="360"/>
+      </w:pPr>
+      <w:r>
+        <w:t xml:space="preserve">1. </w:t>
+      </w:r>
+      <w:r>
+        <w:rPr>
+          <w:b/>
+        </w:rPr>
+        <w:t>Learn first.</w:t>
+      </w:r>
+      <w:r>
+        <w:t xml:space="preserve"> The Learn tab moved to the first position and gained a four-step quick start.</w:t>
+      </w:r>
+    </w:p>
+    <w:p>
+      <w:pPr>
+        <w:spacing w:after="40"/>
+        <w:ind w:left="432" w:hanging="360"/>
+      </w:pPr>
+      <w:r>
+        <w:t xml:space="preserve">2. </w:t>
+      </w:r>
+      <w:r>
+        <w:rPr>
+          <w:b/>
+        </w:rPr>
+        <w:t>First-run setup.</w:t>
+      </w:r>
+      <w:r>
+        <w:t xml:space="preserve"> A dialog on the first visit asks for lung type (four cards with a one-line description of what each teaches), sex, height, weight and mode. It sets the starting volume from the predicted body weight, so a first-time user begins with a defensible setting. It is shown once, skipped for shared links, and can be reopened with "New patient...".</w:t>
+      </w:r>
+    </w:p>
+    <w:p>
+      <w:pPr>
+        <w:spacing w:after="40"/>
+        <w:ind w:left="432" w:hanging="360"/>
+      </w:pPr>
+      <w:r>
+        <w:t xml:space="preserve">3. </w:t>
+      </w:r>
+      <w:r>
+        <w:rPr>
+          <w:b/>
+        </w:rPr>
+        <w:t>Patient bar.</w:t>
+      </w:r>
+      <w:r>
+        <w:t xml:space="preserve"> The patient is now the first thing a learner sees at the top of the simulator, with the predicted body weight and the 6-8 mL/kg range alongside.</w:t>
+      </w:r>
+    </w:p>
+    <w:p>
+      <w:pPr>
+        <w:spacing w:after="40"/>
+        <w:ind w:left="432" w:hanging="360"/>
+      </w:pPr>
+      <w:r>
+        <w:t xml:space="preserve">4. </w:t>
+      </w:r>
+      <w:r>
+        <w:rPr>
+          <w:b/>
+        </w:rPr>
+        <w:t>No scrolling.</w:t>
+      </w:r>
+      <w:r>
+        <w:t xml:space="preserve"> The screen was re-laid out to fit the window (down to 1366 x 768, also with the scenario bar showing), with the measurement table, physics view and mode description moved into a "Measurements" panel in the bottom bar.</w:t>
+      </w:r>
+    </w:p>
+    <w:p>
+      <w:pPr>
+        <w:spacing w:after="40"/>
+        <w:ind w:left="432" w:hanging="360"/>
+      </w:pPr>
+      <w:r>
+        <w:t xml:space="preserve">5. </w:t>
+      </w:r>
+      <w:r>
+        <w:rPr>
+          <w:b/>
+        </w:rPr>
+        <w:t>Hover explanations</w:t>
+      </w:r>
+      <w:r>
+        <w:t xml:space="preserve"> on every key number and dial, and a dismissible one-paragraph "start here" strip.</w:t>
+      </w:r>
+    </w:p>
+    <w:p>
+      <w:pPr>
+        <w:spacing w:after="40"/>
+        <w:ind w:left="432" w:hanging="360"/>
+      </w:pPr>
+      <w:r>
+        <w:t xml:space="preserve">6. </w:t>
+      </w:r>
+      <w:r>
+        <w:rPr>
+          <w:b/>
+        </w:rPr>
+        <w:t>Guided tour.</w:t>
+      </w:r>
+      <w:r>
+        <w:t xml:space="preserve"> Nine steps (patient bar, key numbers, waveforms, lungs, loops, settings, holds and blood gas, more tools, other tabs) outline one area at a time with a short explanation, run automatically once after the first setup, can be replayed from a Tour button, and can be skipped or driven by the keyboard. It is built without a library and records nothing.</w:t>
+      </w:r>
+    </w:p>
+    <w:p>
+      <w:pPr>
+        <w:spacing w:after="120"/>
+      </w:pPr>
+      <w:r>
+        <w:t>The point for developers is that this first-use work was not on the original plan or in the AI's first output; it came from watching other people look at the tool. Section 7.3 adds measures to test whether these changes work.</w:t>
       </w:r>
     </w:p>
     <w:p>
@@ -2565,6 +2911,286 @@
                 <w:sz w:val="17"/>
               </w:rPr>
               <w:t>Needed for reuse, journal eligibility and citation.</w:t>
+            </w:r>
+          </w:p>
+        </w:tc>
+      </w:tr>
+      <w:tr>
+        <w:tc>
+          <w:tcPr>
+            <w:tcW w:type="dxa" w:w="2340"/>
+          </w:tcPr>
+          <w:p>
+            <w:pPr>
+              <w:spacing w:after="0"/>
+            </w:pPr>
+            <w:r/>
+            <w:r>
+              <w:rPr>
+                <w:sz w:val="17"/>
+              </w:rPr>
+              <w:t>D13</w:t>
+            </w:r>
+          </w:p>
+        </w:tc>
+        <w:tc>
+          <w:tcPr>
+            <w:tcW w:type="dxa" w:w="2340"/>
+          </w:tcPr>
+          <w:p>
+            <w:pPr>
+              <w:spacing w:after="0"/>
+            </w:pPr>
+            <w:r/>
+            <w:r>
+              <w:rPr>
+                <w:sz w:val="17"/>
+              </w:rPr>
+              <w:t>Move Learn to the first tab and open it with a 60-second quick start</w:t>
+            </w:r>
+          </w:p>
+        </w:tc>
+        <w:tc>
+          <w:tcPr>
+            <w:tcW w:type="dxa" w:w="2340"/>
+          </w:tcPr>
+          <w:p>
+            <w:pPr>
+              <w:spacing w:after="0"/>
+            </w:pPr>
+            <w:r/>
+            <w:r>
+              <w:rPr>
+                <w:sz w:val="17"/>
+              </w:rPr>
+              <w:t>Leave it after Scenarios</w:t>
+            </w:r>
+          </w:p>
+        </w:tc>
+        <w:tc>
+          <w:tcPr>
+            <w:tcW w:type="dxa" w:w="2340"/>
+          </w:tcPr>
+          <w:p>
+            <w:pPr>
+              <w:spacing w:after="0"/>
+            </w:pPr>
+            <w:r/>
+            <w:r>
+              <w:rPr>
+                <w:sz w:val="17"/>
+              </w:rPr>
+              <w:t>Peer feedback: new users did not know where to start. Guidance should come before the controls.</w:t>
+            </w:r>
+          </w:p>
+        </w:tc>
+      </w:tr>
+      <w:tr>
+        <w:tc>
+          <w:tcPr>
+            <w:tcW w:type="dxa" w:w="2340"/>
+          </w:tcPr>
+          <w:p>
+            <w:pPr>
+              <w:spacing w:after="0"/>
+            </w:pPr>
+            <w:r/>
+            <w:r>
+              <w:rPr>
+                <w:sz w:val="17"/>
+              </w:rPr>
+              <w:t>D14</w:t>
+            </w:r>
+          </w:p>
+        </w:tc>
+        <w:tc>
+          <w:tcPr>
+            <w:tcW w:type="dxa" w:w="2340"/>
+          </w:tcPr>
+          <w:p>
+            <w:pPr>
+              <w:spacing w:after="0"/>
+            </w:pPr>
+            <w:r/>
+            <w:r>
+              <w:rPr>
+                <w:sz w:val="17"/>
+              </w:rPr>
+              <w:t>First-run patient setup dialog (once, skippable, reopenable) and a patient bar at the top</w:t>
+            </w:r>
+          </w:p>
+        </w:tc>
+        <w:tc>
+          <w:tcPr>
+            <w:tcW w:type="dxa" w:w="2340"/>
+          </w:tcPr>
+          <w:p>
+            <w:pPr>
+              <w:spacing w:after="0"/>
+            </w:pPr>
+            <w:r/>
+            <w:r>
+              <w:rPr>
+                <w:sz w:val="17"/>
+              </w:rPr>
+              <w:t>Start everyone on a default normal patient; keep patient settings in a side drawer</w:t>
+            </w:r>
+          </w:p>
+        </w:tc>
+        <w:tc>
+          <w:tcPr>
+            <w:tcW w:type="dxa" w:w="2340"/>
+          </w:tcPr>
+          <w:p>
+            <w:pPr>
+              <w:spacing w:after="0"/>
+            </w:pPr>
+            <w:r/>
+            <w:r>
+              <w:rPr>
+                <w:sz w:val="17"/>
+              </w:rPr>
+              <w:t>The patient is the first decision in ventilation; setup lets a learner choose a case that matches their level. Cost: one extra click for returning users, mitigated by showing it once.</w:t>
+            </w:r>
+          </w:p>
+        </w:tc>
+      </w:tr>
+      <w:tr>
+        <w:tc>
+          <w:tcPr>
+            <w:tcW w:type="dxa" w:w="2340"/>
+          </w:tcPr>
+          <w:p>
+            <w:pPr>
+              <w:spacing w:after="0"/>
+            </w:pPr>
+            <w:r/>
+            <w:r>
+              <w:rPr>
+                <w:sz w:val="17"/>
+              </w:rPr>
+              <w:t>D15</w:t>
+            </w:r>
+          </w:p>
+        </w:tc>
+        <w:tc>
+          <w:tcPr>
+            <w:tcW w:type="dxa" w:w="2340"/>
+          </w:tcPr>
+          <w:p>
+            <w:pPr>
+              <w:spacing w:after="0"/>
+            </w:pPr>
+            <w:r/>
+            <w:r>
+              <w:rPr>
+                <w:sz w:val="17"/>
+              </w:rPr>
+              <w:t>Build the guided tour in-house without a library or tracking</w:t>
+            </w:r>
+          </w:p>
+        </w:tc>
+        <w:tc>
+          <w:tcPr>
+            <w:tcW w:type="dxa" w:w="2340"/>
+          </w:tcPr>
+          <w:p>
+            <w:pPr>
+              <w:spacing w:after="0"/>
+            </w:pPr>
+            <w:r/>
+            <w:r>
+              <w:rPr>
+                <w:sz w:val="17"/>
+              </w:rPr>
+              <w:t>A tour library; a video</w:t>
+            </w:r>
+          </w:p>
+        </w:tc>
+        <w:tc>
+          <w:tcPr>
+            <w:tcW w:type="dxa" w:w="2340"/>
+          </w:tcPr>
+          <w:p>
+            <w:pPr>
+              <w:spacing w:after="0"/>
+            </w:pPr>
+            <w:r/>
+            <w:r>
+              <w:rPr>
+                <w:sz w:val="17"/>
+              </w:rPr>
+              <w:t>No dependency, keeps the no-tracking promise, and the steps stay in sync with the interface.</w:t>
+            </w:r>
+          </w:p>
+        </w:tc>
+      </w:tr>
+      <w:tr>
+        <w:tc>
+          <w:tcPr>
+            <w:tcW w:type="dxa" w:w="2340"/>
+          </w:tcPr>
+          <w:p>
+            <w:pPr>
+              <w:spacing w:after="0"/>
+            </w:pPr>
+            <w:r/>
+            <w:r>
+              <w:rPr>
+                <w:sz w:val="17"/>
+              </w:rPr>
+              <w:t>D16</w:t>
+            </w:r>
+          </w:p>
+        </w:tc>
+        <w:tc>
+          <w:tcPr>
+            <w:tcW w:type="dxa" w:w="2340"/>
+          </w:tcPr>
+          <w:p>
+            <w:pPr>
+              <w:spacing w:after="0"/>
+            </w:pPr>
+            <w:r/>
+            <w:r>
+              <w:rPr>
+                <w:sz w:val="17"/>
+              </w:rPr>
+              <w:t>Fit the simulator to the window with no page scroll; move the measurement table to a panel</w:t>
+            </w:r>
+          </w:p>
+        </w:tc>
+        <w:tc>
+          <w:tcPr>
+            <w:tcW w:type="dxa" w:w="2340"/>
+          </w:tcPr>
+          <w:p>
+            <w:pPr>
+              <w:spacing w:after="0"/>
+            </w:pPr>
+            <w:r/>
+            <w:r>
+              <w:rPr>
+                <w:sz w:val="17"/>
+              </w:rPr>
+              <w:t>Let the page scroll</w:t>
+            </w:r>
+          </w:p>
+        </w:tc>
+        <w:tc>
+          <w:tcPr>
+            <w:tcW w:type="dxa" w:w="2340"/>
+          </w:tcPr>
+          <w:p>
+            <w:pPr>
+              <w:spacing w:after="0"/>
+            </w:pPr>
+            <w:r/>
+            <w:r>
+              <w:rPr>
+                <w:sz w:val="17"/>
+              </w:rPr>
+              <w:t>A learner should see cause and effect at once; scrolling hides the loops or the waveforms.</w:t>
             </w:r>
           </w:p>
         </w:tc>
@@ -3736,6 +4362,146 @@
           </w:p>
         </w:tc>
       </w:tr>
+      <w:tr>
+        <w:tc>
+          <w:tcPr>
+            <w:tcW w:type="dxa" w:w="2340"/>
+          </w:tcPr>
+          <w:p>
+            <w:pPr>
+              <w:spacing w:after="0"/>
+            </w:pPr>
+            <w:r/>
+            <w:r>
+              <w:rPr>
+                <w:sz w:val="17"/>
+              </w:rPr>
+              <w:t>C16</w:t>
+            </w:r>
+          </w:p>
+        </w:tc>
+        <w:tc>
+          <w:tcPr>
+            <w:tcW w:type="dxa" w:w="2340"/>
+          </w:tcPr>
+          <w:p>
+            <w:pPr>
+              <w:spacing w:after="0"/>
+            </w:pPr>
+            <w:r/>
+            <w:r>
+              <w:rPr>
+                <w:sz w:val="17"/>
+              </w:rPr>
+              <w:t>No-scroll layout overflowed at 1366 x 768 when the scenario bar and tips were showing; the bottom bar overlapped the lower strip</w:t>
+            </w:r>
+          </w:p>
+        </w:tc>
+        <w:tc>
+          <w:tcPr>
+            <w:tcW w:type="dxa" w:w="2340"/>
+          </w:tcPr>
+          <w:p>
+            <w:pPr>
+              <w:spacing w:after="0"/>
+            </w:pPr>
+            <w:r/>
+            <w:r>
+              <w:rPr>
+                <w:sz w:val="17"/>
+              </w:rPr>
+              <w:t>Resizing the browser window and measuring</w:t>
+            </w:r>
+          </w:p>
+        </w:tc>
+        <w:tc>
+          <w:tcPr>
+            <w:tcW w:type="dxa" w:w="2340"/>
+          </w:tcPr>
+          <w:p>
+            <w:pPr>
+              <w:spacing w:after="0"/>
+            </w:pPr>
+            <w:r/>
+            <w:r>
+              <w:rPr>
+                <w:sz w:val="17"/>
+              </w:rPr>
+              <w:t>Sized numbers, dials and panes from the space actually available; hid the start strip inside scenarios</w:t>
+            </w:r>
+          </w:p>
+        </w:tc>
+      </w:tr>
+      <w:tr>
+        <w:tc>
+          <w:tcPr>
+            <w:tcW w:type="dxa" w:w="2340"/>
+          </w:tcPr>
+          <w:p>
+            <w:pPr>
+              <w:spacing w:after="0"/>
+            </w:pPr>
+            <w:r/>
+            <w:r>
+              <w:rPr>
+                <w:sz w:val="17"/>
+              </w:rPr>
+              <w:t>C17</w:t>
+            </w:r>
+          </w:p>
+        </w:tc>
+        <w:tc>
+          <w:tcPr>
+            <w:tcW w:type="dxa" w:w="2340"/>
+          </w:tcPr>
+          <w:p>
+            <w:pPr>
+              <w:spacing w:after="0"/>
+            </w:pPr>
+            <w:r/>
+            <w:r>
+              <w:rPr>
+                <w:sz w:val="17"/>
+              </w:rPr>
+              <w:t>The tour outline appeared on the wrong area in the embedded preview because animations were throttled to about 2 frames per second</w:t>
+            </w:r>
+          </w:p>
+        </w:tc>
+        <w:tc>
+          <w:tcPr>
+            <w:tcW w:type="dxa" w:w="2340"/>
+          </w:tcPr>
+          <w:p>
+            <w:pPr>
+              <w:spacing w:after="0"/>
+            </w:pPr>
+            <w:r/>
+            <w:r>
+              <w:rPr>
+                <w:sz w:val="17"/>
+              </w:rPr>
+              <w:t>Screenshot during testing</w:t>
+            </w:r>
+          </w:p>
+        </w:tc>
+        <w:tc>
+          <w:tcPr>
+            <w:tcW w:type="dxa" w:w="2340"/>
+          </w:tcPr>
+          <w:p>
+            <w:pPr>
+              <w:spacing w:after="0"/>
+            </w:pPr>
+            <w:r/>
+            <w:r>
+              <w:rPr>
+                <w:sz w:val="17"/>
+              </w:rPr>
+              <w:t>Removed the slide animation so the outline jumps straight to each step</w:t>
+            </w:r>
+          </w:p>
+        </w:tc>
+      </w:tr>
     </w:tbl>
     <w:p>
       <w:pPr>
@@ -5141,6 +5907,21 @@
         <w:rPr>
           <w:b/>
         </w:rPr>
+        <w:t>First-use measures (new):</w:t>
+      </w:r>
+      <w:r>
+        <w:t xml:space="preserve"> because the first-use experience was revised, add survey items on the tour and quick start (survey items 3a to 3c in the evaluation protocol), and have the facilitator note, without prompting, whether each learner finds the Patient bar, Controls and Insp hold unaided in the first five minutes. Compare, if possible, a cohort that used the tour with one that skipped it.</w:t>
+      </w:r>
+    </w:p>
+    <w:p>
+      <w:pPr>
+        <w:pStyle w:val="ListBullet"/>
+        <w:spacing w:after="40"/>
+      </w:pPr>
+      <w:r>
+        <w:rPr>
+          <w:b/>
+        </w:rPr>
         <w:t>Usage monitoring:</w:t>
       </w:r>
       <w:r>
@@ -5329,6 +6110,24 @@
         <w:rPr>
           <w:b/>
         </w:rPr>
+        <w:t>Show it to people early, and test the first minute.</w:t>
+      </w:r>
+      <w:r>
+        <w:t xml:space="preserve"> Informal peer feedback changed the product more than any further feature would have: the Learn tab moved forward and a guided tour was added because a first-time user could not tell where to start. Neither the author's plan nor the AI's first output covered this.</w:t>
+      </w:r>
+    </w:p>
+    <w:p>
+      <w:pPr>
+        <w:spacing w:after="40"/>
+        <w:ind w:left="432" w:hanging="360"/>
+      </w:pPr>
+      <w:r>
+        <w:t xml:space="preserve">8. </w:t>
+      </w:r>
+      <w:r>
+        <w:rPr>
+          <w:b/>
+        </w:rPr>
         <w:t>Treat AI claims about the outside world with suspicion.</w:t>
       </w:r>
       <w:r>
@@ -5478,7 +6277,7 @@
         <w:spacing w:after="120"/>
       </w:pPr>
       <w:r>
-        <w:t>Single case, single author, single clinical domain. The speed reflects an experienced author directing a capable assistant and is not a promise for novices. AI output varies between runs, so the process is not exactly reproducible; the repository is. The assistant used is a paid product; software hosting and archiving were free but the overall project was not free of cost. The model is a single-compartment lung with unvalidated expiratory behaviour; several parameters are assumptions; hemodynamics are simplified; some modes are absent. No learner data yet; any future evaluation will be a small, single-site, uncontrolled study.</w:t>
+        <w:t>Single case, single author, single clinical domain. The speed reflects an experienced author directing a capable assistant and is not a promise for novices. AI output varies between runs, so the process is not exactly reproducible; the repository is. The assistant used is a paid product; software hosting and archiving were free but the overall project was not free of cost. The model is a single-compartment lung with unvalidated expiratory behaviour; several parameters are assumptions; hemodynamics are simplified; some modes are absent. No learner data yet; any future evaluation will be a small, single-site, uncontrolled study. The peer feedback that shaped the first-use design was informal and unsystematic, so it may not represent typical learners, and the effect of the revisions has not been measured.</w:t>
       </w:r>
     </w:p>
     <w:p>
@@ -5599,7 +6398,7 @@
         <w:ind w:left="432" w:hanging="360"/>
       </w:pPr>
       <w:r>
-        <w:t>9. Deploy with tests as a gate; add a persistent identifier, licence, privacy statement, feedback path.</w:t>
+        <w:t>9. Show it to someone who has never seen it and watch the first minute; add orientation (a start page, a first-run setup, hover help and a short tour) where they hesitate.</w:t>
       </w:r>
     </w:p>
     <w:p>
@@ -5608,7 +6407,7 @@
         <w:ind w:left="432" w:hanging="360"/>
       </w:pPr>
       <w:r>
-        <w:t>10. Get clinical review; pilot the assessment; obtain ethics approval; then test with learners.</w:t>
+        <w:t>10. Deploy with tests as a gate; add a persistent identifier, licence, privacy statement, feedback path.</w:t>
       </w:r>
     </w:p>
     <w:p>
@@ -5617,7 +6416,16 @@
         <w:ind w:left="432" w:hanging="360"/>
       </w:pPr>
       <w:r>
-        <w:t>11. Publish all results, including negative ones; keep a changelog and fix reported errors.</w:t>
+        <w:t>11. Get clinical review; pilot the assessment; obtain ethics approval; then test with learners.</w:t>
+      </w:r>
+    </w:p>
+    <w:p>
+      <w:pPr>
+        <w:spacing w:after="40"/>
+        <w:ind w:left="432" w:hanging="360"/>
+      </w:pPr>
+      <w:r>
+        <w:t>12. Publish all results, including negative ones; keep a changelog and fix reported errors.</w:t>
       </w:r>
     </w:p>
     <w:p>

</xml_diff>